<commit_message>
Simplify notebook explanations, code, and dataset report
</commit_message>
<xml_diff>
--- a/report/Exercise0_Report.docx
+++ b/report/Exercise0_Report.docx
@@ -22,12 +22,12 @@
     </w:p>
     <w:p>
       <w:r>
-        <w:t>We selected MembershipWoes (OpenML 44225, version 2) and Dermatology (UCI 33) for their contrasting sizes, measurement types, and classification tasks. Both have missing inputs and require preprocessing [1, 2].</w:t>
+        <w:t>We chose MembershipWoes (OpenML 44225, version 2) and Dermatology (UCI 33) because they differ in size, feature types, and number of classes. Both have missing values to handle before modelling [1, 2].</w:t>
       </w:r>
     </w:p>
     <w:p>
       <w:r>
-        <w:t>MembershipWoes has 10,362 records and 14 non-target columns: five quantities, six nominal fields, two dates, and one identifier. Dermatology has 366 patients and 34 inputs.</w:t>
+        <w:t>MembershipWoes has 10,362 records and 14 columns besides the target: five quantitative inputs, six nominal fields, two dates, and an ID. Dermatology has 366 patients and 34 inputs.</w:t>
       </w:r>
     </w:p>
     <w:p>
@@ -40,7 +40,7 @@
     </w:p>
     <w:p>
       <w:r>
-        <w:t>The binary target has 7,219 INFORCE records (69.67%) and 3,143 CANCELLED records (30.33%). Age at issue ranges from 0 to 92 years (median 46); additional members from 0 to 3. Fees span 0–10,100,000 (median 118,209.28), and observed income 9,996–999,999,996. Currency is unspecified. Four zero ages and terms up to 102 years warrant clarification. Occupation and agent codes are nominal; agent code has 4,317 levels.</w:t>
+        <w:t>The target has two classes: 7,219 INFORCE records (69.67%) and 3,143 CANCELLED (30.33%). Age at issue ranges from 0 to 92 years, with median 46; additional members range from 0 to 3. Annual fees range from 0 to 10,100,000, with median 118,209.28. Observed income ranges from 9,996 to 999,999,996. The currency is not given. Four zero ages and terms up to 102 years need checking. Occupation and agent codes are categories; there are 4,317 agent codes.</w:t>
       </w:r>
     </w:p>
     <w:p>
@@ -88,12 +88,12 @@
         <w:pStyle w:val="Caption"/>
       </w:pPr>
       <w:r>
-        <w:t>Figure 1. Missing values among all 10,362 records; labels give percentages and counts.</w:t>
+        <w:t>Figure 1. Missing values out of 10,362 records. Labels show percentages and counts.</w:t>
       </w:r>
     </w:p>
     <w:p>
       <w:r>
-        <w:t>Missingness affects 8,024 rows (77.44%). Every cancelled membership has an end date; every in-force membership lacks one. Exclude end date and its availability indicator unless prediction timing justifies their use. Removing the unique identifier and end date leaves 12 candidate fields.</w:t>
+        <w:t>At least one value is missing in 8,024 rows (77.44%). Every cancelled membership has an end date, while every in-force membership has none. This could give away the outcome. For advance prediction, we should leave out end date and its missing-value flag unless their timing is known. Removing the ID and end date leaves 12 possible inputs.</w:t>
       </w:r>
     </w:p>
     <w:p>
@@ -141,12 +141,12 @@
         <w:pStyle w:val="Caption"/>
       </w:pPr>
       <w:r>
-        <w:t>Figure 2. Cancellation percentages within each package, with cancelled/total counts.</w:t>
+        <w:t>Figure 2. Cancellation rate within each package. Labels show cancelled and total records.</w:t>
       </w:r>
     </w:p>
     <w:p>
       <w:r>
-        <w:t>Package rates differ: 16.63% for Type A and 37.48% for Type B. Other group differences could contribute. Future modelling requires suitable category encoding, missing-value handling, and checked transformations or scaling of monetary inputs.</w:t>
+        <w:t>Cancellation rates are 16.63% for Type A and 37.48% for Type B. The groups may differ in other ways, so this does not show that package causes cancellation. Before modelling, we need to handle missing inputs, encode categories, and consider a transformation or scaling for fees and income.</w:t>
       </w:r>
     </w:p>
     <w:p>
@@ -164,12 +164,12 @@
     </w:p>
     <w:p>
       <w:r>
-        <w:t>The 34 inputs comprise 12 clinical variables and 22 biopsy-based findings. Thirty-two scores have ordinal degrees 0–3 (absent to largest); equal clinical intervals are not established. Family history is binary nominal, age quantitative, and disease codes nominal [2].</w:t>
+        <w:t>There are 12 clinical inputs and 22 findings from skin samples. Thirty-two inputs are ordinal scores from 0 (absent) to 3 (largest degree). Their order matters, but the gaps need not be equal. Family history is binary nominal, age quantitative, and disease codes nominal [2].</w:t>
       </w:r>
     </w:p>
     <w:p>
       <w:r>
-        <w:t>Class counts are psoriasis 112 (30.60%), seborrhoeic dermatitis 61 (16.67%), lichen planus 72 (19.67%), pityriasis rosea 49 (13.39%), chronic dermatitis 52 (14.21%), and pityriasis rubra pilaris (PRP) 20 (5.46%). The 5.6-fold largest/smallest imbalance supports stratified evaluation and per-class metrics.</w:t>
+        <w:t>The classes are psoriasis 112 (30.60%), seborrhoeic dermatitis 61 (16.67%), lichen planus 72 (19.67%), pityriasis rosea 49 (13.39%), chronic dermatitis 52 (14.21%), and pityriasis rubra pilaris (PRP) 20 (5.46%). The largest class is 5.6 times the smallest, so later evaluation needs stratified splits and results for each class.</w:t>
       </w:r>
     </w:p>
     <w:p>
@@ -217,12 +217,12 @@
         <w:pStyle w:val="Caption"/>
       </w:pPr>
       <w:r>
-        <w:t>Figure 3. Observed ages by disease. Boxes show the middle 50% and medians; whiskers use 1.5 × IQR. Eight missing ages are omitted; zero age is retained.</w:t>
+        <w:t>Figure 3. Ages by disease. Boxes show the middle 50% and medians; whiskers use 1.5 times the interquartile range. Eight missing ages are excluded; zero age is kept.</w:t>
       </w:r>
     </w:p>
     <w:p>
       <w:r>
-        <w:t>Age is the only incomplete input (8/366, 2.19%). Observed ages span 0–75 (median 35). PRP has median 9.5 years, compared with 34–40 for the other classes. These sample patterns do not establish diagnostic rules.</w:t>
+        <w:t>Only age has missing values: 8 out of 366 (2.19%). Observed ages range from 0 to 75 years, with median 35. PRP has median 9.5 years, compared with 34–40 for the other classes. This sample difference is not a diagnostic rule.</w:t>
       </w:r>
     </w:p>
     <w:p>
@@ -270,12 +270,12 @@
         <w:pStyle w:val="Caption"/>
       </w:pPr>
       <w:r>
-        <w:t>Figure 4. First five clinical scores in documented order; each bar includes all 366 patients. Segment labels show rounded percentages of at least 8%.</w:t>
+        <w:t>Figure 4. The first five clinical scores in source order. Each bar includes 366 patients; labels show rounded percentages for segments of at least 8%.</w:t>
       </w:r>
     </w:p>
     <w:p>
       <w:r>
-        <w:t>Scaling degree 2 is most frequent (53.28%); family history is positive in 46 patients (12.57%). No complete duplicate rows occur. Preserve score order and fit any age imputation or scaling only on training folds. Biopsy-dependent inputs limit interpretation as a clinical-only screening task.</w:t>
+        <w:t>For the skin finding scaling, degree 2 is most common (53.28%). Family history is positive for 46 patients (12.57%). There are no duplicate rows. Keep scores ordered and fit age imputation or scaling on training data only. The skin-sample inputs would not be available from a clinical examination alone.</w:t>
       </w:r>
     </w:p>
     <w:p>
@@ -298,7 +298,7 @@
         <w:br/>
         <w:t>[2] Ilter, N., &amp; Guvenir, H. (1998). Dermatology [Dataset]. UCI Machine Learning Repository. https://doi.org/10.24432/C5FK5P</w:t>
         <w:br/>
-        <w:t>Accessed 24 October 2026. The accompanying notebooks record source fingerprints and package versions, and contain all analysis and plotting code. Figures are copied directly from executed notebook outputs.</w:t>
+        <w:t>Sources accessed 24 October 2026. The notebooks contain the data checks, NumPy and pandas versions, and all analysis and plotting code. The figures come directly from their saved outputs.</w:t>
       </w:r>
     </w:p>
     <w:sectPr>

</xml_diff>